<commit_message>
Pregunta de seguimiento en web/movil y documentacion final actualizada
Co-authored-by: Copilot <223556219+Copilot@users.noreply.github.com>
</commit_message>
<xml_diff>
--- a/Documentacion_Tecnica_TutoUdec_Final.docx
+++ b/Documentacion_Tecnica_TutoUdec_Final.docx
@@ -1086,6 +1086,62 @@
         <w:pStyle w:val="Heading2"/>
       </w:pPr>
       <w:r>
+        <w:t>6.1b Modo IA y JSON empresarial 5.0</w:t>
+      </w:r>
+    </w:p>
+    <w:p>
+      <w:pPr>
+        <w:pStyle w:val="ListBullet"/>
+      </w:pPr>
+      <w:r>
+        <w:t>backend/api/ai_chatbot.py: con AI_ENABLED=true y OPENAI_API_KEY usa un LLM (OPENAI_MODEL, por defecto gpt-4o-mini); si falla o no hay clave, usa el motor local.</w:t>
+      </w:r>
+    </w:p>
+    <w:p>
+      <w:pPr>
+        <w:pStyle w:val="ListBullet"/>
+      </w:pPr>
+      <w:r>
+        <w:t>La respuesta incluye response_json con standard "empresarial-5.0", mode (rules/ai), provider, answer, follow_up_question, unknown, confidence, intent, suggestions y business_5_0 (human_centered, data_driven, sustainable, automation, ethical_ai).</w:t>
+      </w:r>
+    </w:p>
+    <w:p>
+      <w:pPr>
+        <w:pStyle w:val="ListBullet"/>
+      </w:pPr>
+      <w:r>
+        <w:t>Siempre se devuelve una pregunta de seguimiento para sostener la conversación; web y móvil la muestran.</w:t>
+      </w:r>
+    </w:p>
+    <w:p>
+      <w:pPr>
+        <w:pStyle w:val="Heading2"/>
+      </w:pPr>
+      <w:r>
+        <w:t>6.1c Azure</w:t>
+      </w:r>
+    </w:p>
+    <w:p>
+      <w:pPr>
+        <w:pStyle w:val="ListBullet"/>
+      </w:pPr>
+      <w:r>
+        <w:t>Suscripción Azure for Students; VM Linux "Backend" (grupo Backend_group), IP 4.206.201.129, nginx (puerto 80) + gunicorn.</w:t>
+      </w:r>
+    </w:p>
+    <w:p>
+      <w:pPr>
+        <w:pStyle w:val="ListBullet"/>
+      </w:pPr>
+      <w:r>
+        <w:t>Código actualizado al commit 7375ff1 y API respondiendo en http://4.206.201.129/api/. Pendiente: HTTPS y revisar las credenciales de PostgreSQL de la VM.</w:t>
+      </w:r>
+    </w:p>
+    <w:p>
+      <w:pPr>
+        <w:pStyle w:val="Heading2"/>
+      </w:pPr>
+      <w:r>
         <w:t>6.2 Pruebas</w:t>
       </w:r>
     </w:p>
@@ -1094,7 +1150,7 @@
         <w:pStyle w:val="ListBullet"/>
       </w:pPr>
       <w:r>
-        <w:t>10 pruebas automáticas del backend (python backend/manage.py test), incluidas 3 del chatbot: mensaje vacío, preguntas sobre la universidad y desconocimiento honesto. Resultado: OK.</w:t>
+        <w:t>11 pruebas automáticas del backend (python backend/manage.py test), incluidas 3 del chatbot: mensaje vacío, preguntas sobre la universidad y desconocimiento honesto. Resultado: OK.</w:t>
       </w:r>
     </w:p>
     <w:p>
@@ -1198,7 +1254,7 @@
         <w:pStyle w:val="ListBullet"/>
       </w:pPr>
       <w:r>
-        <w:t>El chatbot es un asistente basado en reglas; no usa un modelo de lenguaje externo.</w:t>
+        <w:t>Por defecto el chatbot usa reglas; el modo LLM requiere una clave OpenAI configurada como variable de entorno.</w:t>
       </w:r>
     </w:p>
     <w:p>

</xml_diff>

<commit_message>
Analisis exploratorio, nginx de Azure, README y Word final
Co-authored-by: Copilot <223556219+Copilot@users.noreply.github.com>
</commit_message>
<xml_diff>
--- a/Documentacion_Tecnica_TutoUdec_Final.docx
+++ b/Documentacion_Tecnica_TutoUdec_Final.docx
@@ -538,7 +538,7 @@
     </w:tbl>
     <w:p>
       <w:r>
-        <w:t>Datos de demostración actuales: 21 usuarios, 20 tutores, 25 materias, 515 franjas de disponibilidad, 8 grupos y 6 tutorías.</w:t>
+        <w:t>Datos de demostración: en el entorno local 21 usuarios, 20 tutores, 25 materias, 515 franjas, 8 grupos y 6 tutorías; en Azure 25 materias, 20 tutores, 84 franjas, 8 grupos y 6 tutorías.</w:t>
       </w:r>
     </w:p>
     <w:p>
@@ -1118,7 +1118,7 @@
         <w:pStyle w:val="Heading2"/>
       </w:pPr>
       <w:r>
-        <w:t>6.1c Azure</w:t>
+        <w:t>6.1c Despliegue en Azure</w:t>
       </w:r>
     </w:p>
     <w:p>
@@ -1126,7 +1126,7 @@
         <w:pStyle w:val="ListBullet"/>
       </w:pPr>
       <w:r>
-        <w:t>Suscripción Azure for Students; VM Linux "Backend" (grupo Backend_group), IP 4.206.201.129, nginx (puerto 80) + gunicorn.</w:t>
+        <w:t>Suscripción Azure for Students; máquina virtual Linux "Backend" (grupo de recursos Backend_group), IP pública 4.206.201.129, puertos 22, 80 y 8000 abiertos en el NSG.</w:t>
       </w:r>
     </w:p>
     <w:p>
@@ -1134,7 +1134,103 @@
         <w:pStyle w:val="ListBullet"/>
       </w:pPr>
       <w:r>
-        <w:t>Código actualizado al commit 7375ff1 y API respondiendo en http://4.206.201.129/api/. Pendiente: HTTPS y revisar las credenciales de PostgreSQL de la VM.</w:t>
+        <w:t>nginx (puerto 80) sirve la web compilada (/var/www/tutoudec) y reenvía /api/, /admin/, /static/ y /docs/ a gunicorn (127.0.0.1:8000). PostgreSQL local en la VM.</w:t>
+      </w:r>
+    </w:p>
+    <w:p>
+      <w:pPr>
+        <w:pStyle w:val="ListBullet"/>
+      </w:pPr>
+      <w:r>
+        <w:t>Servicio systemd gunicorn.service con el código en /home/cristian/TutoUdecProyect (rama main del repositorio).</w:t>
+      </w:r>
+    </w:p>
+    <w:p>
+      <w:pPr>
+        <w:pStyle w:val="ListBullet"/>
+      </w:pPr>
+      <w:r>
+        <w:t>URLs públicas: web http://4.206.201.129/ · API http://4.206.201.129/api/ · documentación http://4.206.201.129/docs/</w:t>
+      </w:r>
+    </w:p>
+    <w:p>
+      <w:pPr>
+        <w:pStyle w:val="ListBullet"/>
+      </w:pPr>
+      <w:r>
+        <w:t>Correcciones hechas el 23/10/2026: la DATABASE_URL usaba un usuario inexistente (tutoudec_db) y provocaba error 500 en toda la API; se usó el rol tutoudec_user con nueva contraseña, se reasignó la propiedad de las tablas, se aplicó la migración 0003, se cargaron los datos de ejemplo (seed_data) y se publicó la web en nginx.</w:t>
+      </w:r>
+    </w:p>
+    <w:p>
+      <w:pPr>
+        <w:pStyle w:val="ListBullet"/>
+      </w:pPr>
+      <w:r>
+        <w:t>Datos en la nube: 25 materias, 20 tutores, 84 franjas de disponibilidad, 8 grupos y 6 tutorías.</w:t>
+      </w:r>
+    </w:p>
+    <w:p>
+      <w:pPr>
+        <w:pStyle w:val="ListBullet"/>
+      </w:pPr>
+      <w:r>
+        <w:t>Pendiente recomendado: HTTPS con dominio o certificado, y copias de seguridad de PostgreSQL.</w:t>
+      </w:r>
+    </w:p>
+    <w:p>
+      <w:pPr>
+        <w:pStyle w:val="Heading2"/>
+      </w:pPr>
+      <w:r>
+        <w:t>6.1d Dashboard y análisis exploratorio</w:t>
+      </w:r>
+    </w:p>
+    <w:p>
+      <w:pPr>
+        <w:pStyle w:val="ListBullet"/>
+      </w:pPr>
+      <w:r>
+        <w:t>Dashboard (web, /dashboard, solo administradores): indicadores (usuarios, tutores, materias, tutorías, calificación promedio), tutorías por estado, por mes y por materia, alimentado por GET /api/dashboard/resumen/. Verificado en la nube con login real: usuarios 23, tutores 20, materias 25, tutorías 6.</w:t>
+      </w:r>
+    </w:p>
+    <w:p>
+      <w:pPr>
+        <w:pStyle w:val="ListBullet"/>
+      </w:pPr>
+      <w:r>
+        <w:t>Análisis exploratorio (analytics/eda_tutoudec.py): lee la API pública, usa pandas y matplotlib y genera gráficas e informe en analytics/output. Ver sección 9.</w:t>
+      </w:r>
+    </w:p>
+    <w:p>
+      <w:pPr>
+        <w:pStyle w:val="Heading2"/>
+      </w:pPr>
+      <w:r>
+        <w:t>6.1e APK de Android</w:t>
+      </w:r>
+    </w:p>
+    <w:p>
+      <w:pPr>
+        <w:pStyle w:val="ListBullet"/>
+      </w:pPr>
+      <w:r>
+        <w:t>Compilado en la nube de Expo (EAS Build, perfil preview, tipo apk) con EXPO_PUBLIC_API_URL=http://4.206.201.129/api.</w:t>
+      </w:r>
+    </w:p>
+    <w:p>
+      <w:pPr>
+        <w:pStyle w:val="ListBullet"/>
+      </w:pPr>
+      <w:r>
+        <w:t>Archivo en el repositorio: TutoUdec-Final.apk. Los APK anteriores fueron eliminados.</w:t>
+      </w:r>
+    </w:p>
+    <w:p>
+      <w:pPr>
+        <w:pStyle w:val="ListBullet"/>
+      </w:pPr>
+      <w:r>
+        <w:t>La app permite tráfico HTTP (usesCleartextTraffic) mientras el servidor no tenga HTTPS.</w:t>
       </w:r>
     </w:p>
     <w:p>
@@ -1222,7 +1318,7 @@
         <w:pStyle w:val="ListBullet"/>
       </w:pPr>
       <w:r>
-        <w:t>APK: workflow build-android.yml con secreto EXPO_TOKEN y variable EXPO_PUBLIC_API_URL (HTTPS).</w:t>
+        <w:t>APK: compilado con EAS Build (cuenta Expo) usando EXPO_PUBLIC_API_URL; alternativamente el workflow build-android.yml con el secreto EXPO_TOKEN.</w:t>
       </w:r>
     </w:p>
     <w:p>
@@ -1246,7 +1342,7 @@
         <w:pStyle w:val="ListBullet"/>
       </w:pPr>
       <w:r>
-        <w:t>Generar el APK final requiere sesión de Expo (EXPO_TOKEN) o un entorno con JDK 17 y Android SDK.</w:t>
+        <w:t>Activar HTTPS en Azure (dominio o certificado) y rotar cualquier token compartido por chat (Expo).</w:t>
       </w:r>
     </w:p>
     <w:p>
@@ -1254,7 +1350,7 @@
         <w:pStyle w:val="ListBullet"/>
       </w:pPr>
       <w:r>
-        <w:t>Por defecto el chatbot usa reglas; el modo LLM requiere una clave OpenAI configurada como variable de entorno.</w:t>
+        <w:t>Por defecto el chatbot usa reglas; el modo LLM requiere una clave OpenAI configurada como variable de entorno (AI_ENABLED, OPENAI_API_KEY).</w:t>
       </w:r>
     </w:p>
     <w:p>
@@ -1265,6 +1361,476 @@
         <w:t>Los datos de la universidad provienen de una compilación con fecha 23/10/2026 y deben verificarse en www.ucundinamarca.edu.co.</w:t>
       </w:r>
     </w:p>
+    <w:p>
+      <w:pPr>
+        <w:pStyle w:val="ListBullet"/>
+      </w:pPr>
+      <w:r>
+        <w:t>Los datos de la nube son de demostración; las calificaciones son todas 5.0 y no hay reseñas reales, por lo que el análisis de correlación no es concluyente.</w:t>
+      </w:r>
+    </w:p>
+    <w:p>
+      <w:pPr>
+        <w:pStyle w:val="Heading1"/>
+      </w:pPr>
+      <w:r>
+        <w:t>9. Análisis exploratorio de datos</w:t>
+      </w:r>
+    </w:p>
+    <w:p>
+      <w:r>
+        <w:t>Fuente: API de Azure (20 tutores, 25 materias, 84 franjas de disponibilidad). Script: analytics/eda_tutoudec.py.</w:t>
+      </w:r>
+    </w:p>
+    <w:p>
+      <w:pPr>
+        <w:pStyle w:val="ListBullet"/>
+      </w:pPr>
+      <w:r>
+        <w:t>Tarifa promedio de $34.450 COP/h (mínimo $25.000, máximo $50.000); crece con el nivel: intermedio ≈ $27.667, avanzado ≈ $34.286, experto ≈ $40.429.</w:t>
+      </w:r>
+    </w:p>
+    <w:p>
+      <w:pPr>
+        <w:pStyle w:val="ListBullet"/>
+      </w:pPr>
+      <w:r>
+        <w:t>Jueves es el día con más disponibilidad y lunes el de menos; el tutor con más oferta ofrece 14 horas semanales.</w:t>
+      </w:r>
+    </w:p>
+    <w:p>
+      <w:pPr>
+        <w:pStyle w:val="ListBullet"/>
+      </w:pPr>
+      <w:r>
+        <w:t>20 de las 25 materias aún no tienen tutorías registradas: oportunidad de promover la demanda.</w:t>
+      </w:r>
+    </w:p>
+    <w:p>
+      <w:pPr>
+        <w:pStyle w:val="ListBullet"/>
+      </w:pPr>
+      <w:r>
+        <w:t>Todas las calificaciones son 5.0 (datos de prueba), por lo que no se puede medir la relación tarifa-calificación.</w:t>
+      </w:r>
+    </w:p>
+    <w:p>
+      <w:r>
+        <w:t>Distribución de tarifas</w:t>
+      </w:r>
+    </w:p>
+    <w:p>
+      <w:r>
+        <w:drawing>
+          <wp:inline xmlns:a="http://schemas.openxmlformats.org/drawingml/2006/main" xmlns:pic="http://schemas.openxmlformats.org/drawingml/2006/picture">
+            <wp:extent cx="5029200" cy="2873829"/>
+            <wp:docPr id="1" name="Picture 1"/>
+            <wp:cNvGraphicFramePr>
+              <a:graphicFrameLocks noChangeAspect="1"/>
+            </wp:cNvGraphicFramePr>
+            <a:graphic>
+              <a:graphicData uri="http://schemas.openxmlformats.org/drawingml/2006/picture">
+                <pic:pic>
+                  <pic:nvPicPr>
+                    <pic:cNvPr id="0" name="01_tarifas.png"/>
+                    <pic:cNvPicPr/>
+                  </pic:nvPicPr>
+                  <pic:blipFill>
+                    <a:blip r:embed="rId9"/>
+                    <a:stretch>
+                      <a:fillRect/>
+                    </a:stretch>
+                  </pic:blipFill>
+                  <pic:spPr>
+                    <a:xfrm>
+                      <a:off x="0" y="0"/>
+                      <a:ext cx="5029200" cy="2873829"/>
+                    </a:xfrm>
+                    <a:prstGeom prst="rect"/>
+                  </pic:spPr>
+                </pic:pic>
+              </a:graphicData>
+            </a:graphic>
+          </wp:inline>
+        </w:drawing>
+      </w:r>
+    </w:p>
+    <w:p>
+      <w:r>
+        <w:t>Tarifa por nivel de experiencia</w:t>
+      </w:r>
+    </w:p>
+    <w:p>
+      <w:r>
+        <w:drawing>
+          <wp:inline xmlns:a="http://schemas.openxmlformats.org/drawingml/2006/main" xmlns:pic="http://schemas.openxmlformats.org/drawingml/2006/picture">
+            <wp:extent cx="5029200" cy="2873829"/>
+            <wp:docPr id="2" name="Picture 2"/>
+            <wp:cNvGraphicFramePr>
+              <a:graphicFrameLocks noChangeAspect="1"/>
+            </wp:cNvGraphicFramePr>
+            <a:graphic>
+              <a:graphicData uri="http://schemas.openxmlformats.org/drawingml/2006/picture">
+                <pic:pic>
+                  <pic:nvPicPr>
+                    <pic:cNvPr id="0" name="02_tarifa_nivel.png"/>
+                    <pic:cNvPicPr/>
+                  </pic:nvPicPr>
+                  <pic:blipFill>
+                    <a:blip r:embed="rId10"/>
+                    <a:stretch>
+                      <a:fillRect/>
+                    </a:stretch>
+                  </pic:blipFill>
+                  <pic:spPr>
+                    <a:xfrm>
+                      <a:off x="0" y="0"/>
+                      <a:ext cx="5029200" cy="2873829"/>
+                    </a:xfrm>
+                    <a:prstGeom prst="rect"/>
+                  </pic:spPr>
+                </pic:pic>
+              </a:graphicData>
+            </a:graphic>
+          </wp:inline>
+        </w:drawing>
+      </w:r>
+    </w:p>
+    <w:p>
+      <w:r>
+        <w:t>Tutores por especialidad</w:t>
+      </w:r>
+    </w:p>
+    <w:p>
+      <w:r>
+        <w:drawing>
+          <wp:inline xmlns:a="http://schemas.openxmlformats.org/drawingml/2006/main" xmlns:pic="http://schemas.openxmlformats.org/drawingml/2006/picture">
+            <wp:extent cx="5029200" cy="2873829"/>
+            <wp:docPr id="3" name="Picture 3"/>
+            <wp:cNvGraphicFramePr>
+              <a:graphicFrameLocks noChangeAspect="1"/>
+            </wp:cNvGraphicFramePr>
+            <a:graphic>
+              <a:graphicData uri="http://schemas.openxmlformats.org/drawingml/2006/picture">
+                <pic:pic>
+                  <pic:nvPicPr>
+                    <pic:cNvPr id="0" name="03_especialidades.png"/>
+                    <pic:cNvPicPr/>
+                  </pic:nvPicPr>
+                  <pic:blipFill>
+                    <a:blip r:embed="rId11"/>
+                    <a:stretch>
+                      <a:fillRect/>
+                    </a:stretch>
+                  </pic:blipFill>
+                  <pic:spPr>
+                    <a:xfrm>
+                      <a:off x="0" y="0"/>
+                      <a:ext cx="5029200" cy="2873829"/>
+                    </a:xfrm>
+                    <a:prstGeom prst="rect"/>
+                  </pic:spPr>
+                </pic:pic>
+              </a:graphicData>
+            </a:graphic>
+          </wp:inline>
+        </w:drawing>
+      </w:r>
+    </w:p>
+    <w:p>
+      <w:r>
+        <w:t>Disponibilidad por día</w:t>
+      </w:r>
+    </w:p>
+    <w:p>
+      <w:r>
+        <w:drawing>
+          <wp:inline xmlns:a="http://schemas.openxmlformats.org/drawingml/2006/main" xmlns:pic="http://schemas.openxmlformats.org/drawingml/2006/picture">
+            <wp:extent cx="5029200" cy="2873829"/>
+            <wp:docPr id="4" name="Picture 4"/>
+            <wp:cNvGraphicFramePr>
+              <a:graphicFrameLocks noChangeAspect="1"/>
+            </wp:cNvGraphicFramePr>
+            <a:graphic>
+              <a:graphicData uri="http://schemas.openxmlformats.org/drawingml/2006/picture">
+                <pic:pic>
+                  <pic:nvPicPr>
+                    <pic:cNvPr id="0" name="04_disponibilidad_dia.png"/>
+                    <pic:cNvPicPr/>
+                  </pic:nvPicPr>
+                  <pic:blipFill>
+                    <a:blip r:embed="rId12"/>
+                    <a:stretch>
+                      <a:fillRect/>
+                    </a:stretch>
+                  </pic:blipFill>
+                  <pic:spPr>
+                    <a:xfrm>
+                      <a:off x="0" y="0"/>
+                      <a:ext cx="5029200" cy="2873829"/>
+                    </a:xfrm>
+                    <a:prstGeom prst="rect"/>
+                  </pic:spPr>
+                </pic:pic>
+              </a:graphicData>
+            </a:graphic>
+          </wp:inline>
+        </w:drawing>
+      </w:r>
+    </w:p>
+    <w:p>
+      <w:r>
+        <w:t>Materias con más tutorías</w:t>
+      </w:r>
+    </w:p>
+    <w:p>
+      <w:r>
+        <w:drawing>
+          <wp:inline xmlns:a="http://schemas.openxmlformats.org/drawingml/2006/main" xmlns:pic="http://schemas.openxmlformats.org/drawingml/2006/picture">
+            <wp:extent cx="5029200" cy="2873829"/>
+            <wp:docPr id="5" name="Picture 5"/>
+            <wp:cNvGraphicFramePr>
+              <a:graphicFrameLocks noChangeAspect="1"/>
+            </wp:cNvGraphicFramePr>
+            <a:graphic>
+              <a:graphicData uri="http://schemas.openxmlformats.org/drawingml/2006/picture">
+                <pic:pic>
+                  <pic:nvPicPr>
+                    <pic:cNvPr id="0" name="06_materias_top.png"/>
+                    <pic:cNvPicPr/>
+                  </pic:nvPicPr>
+                  <pic:blipFill>
+                    <a:blip r:embed="rId13"/>
+                    <a:stretch>
+                      <a:fillRect/>
+                    </a:stretch>
+                  </pic:blipFill>
+                  <pic:spPr>
+                    <a:xfrm>
+                      <a:off x="0" y="0"/>
+                      <a:ext cx="5029200" cy="2873829"/>
+                    </a:xfrm>
+                    <a:prstGeom prst="rect"/>
+                  </pic:spPr>
+                </pic:pic>
+              </a:graphicData>
+            </a:graphic>
+          </wp:inline>
+        </w:drawing>
+      </w:r>
+    </w:p>
+    <w:p>
+      <w:pPr>
+        <w:pStyle w:val="Heading1"/>
+      </w:pPr>
+      <w:r>
+        <w:t>10. Cumplimiento de los requisitos del proyecto</w:t>
+      </w:r>
+    </w:p>
+    <w:tbl>
+      <w:tblPr>
+        <w:tblStyle w:val="LightGrid-Accent1"/>
+        <w:tblW w:type="auto" w:w="0"/>
+        <w:tblLook w:firstColumn="1" w:firstRow="1" w:lastColumn="0" w:lastRow="0" w:noHBand="0" w:noVBand="1" w:val="04A0"/>
+      </w:tblPr>
+      <w:tblGrid>
+        <w:gridCol w:w="2880"/>
+        <w:gridCol w:w="2880"/>
+        <w:gridCol w:w="2880"/>
+      </w:tblGrid>
+      <w:tr>
+        <w:tc>
+          <w:tcPr>
+            <w:tcW w:type="dxa" w:w="2880"/>
+          </w:tcPr>
+          <w:p>
+            <w:r>
+              <w:t>Requisito</w:t>
+            </w:r>
+          </w:p>
+        </w:tc>
+        <w:tc>
+          <w:tcPr>
+            <w:tcW w:type="dxa" w:w="2880"/>
+          </w:tcPr>
+          <w:p>
+            <w:r>
+              <w:t>Estado</w:t>
+            </w:r>
+          </w:p>
+        </w:tc>
+        <w:tc>
+          <w:tcPr>
+            <w:tcW w:type="dxa" w:w="2880"/>
+          </w:tcPr>
+          <w:p>
+            <w:r>
+              <w:t>Evidencia</w:t>
+            </w:r>
+          </w:p>
+        </w:tc>
+      </w:tr>
+      <w:tr>
+        <w:tc>
+          <w:tcPr>
+            <w:tcW w:type="dxa" w:w="2880"/>
+          </w:tcPr>
+          <w:p>
+            <w:r>
+              <w:t>Prototipo funcional con mínimo 8 funcionalidades</w:t>
+            </w:r>
+          </w:p>
+        </w:tc>
+        <w:tc>
+          <w:tcPr>
+            <w:tcW w:type="dxa" w:w="2880"/>
+          </w:tcPr>
+          <w:p>
+            <w:r>
+              <w:t>Cumple</w:t>
+            </w:r>
+          </w:p>
+        </w:tc>
+        <w:tc>
+          <w:tcPr>
+            <w:tcW w:type="dxa" w:w="2880"/>
+          </w:tcPr>
+          <w:p>
+            <w:r>
+              <w:t>Registro/login/recuperación, tutores, materias, tutorías, disponibilidad, reseñas, grupos e inscripciones, perfil, chatbot, dashboard.</w:t>
+            </w:r>
+          </w:p>
+        </w:tc>
+      </w:tr>
+      <w:tr>
+        <w:tc>
+          <w:tcPr>
+            <w:tcW w:type="dxa" w:w="2880"/>
+          </w:tcPr>
+          <w:p>
+            <w:r>
+              <w:t>Prototipo web y móvil con base de datos, expuesto en la nube</w:t>
+            </w:r>
+          </w:p>
+        </w:tc>
+        <w:tc>
+          <w:tcPr>
+            <w:tcW w:type="dxa" w:w="2880"/>
+          </w:tcPr>
+          <w:p>
+            <w:r>
+              <w:t>Cumple</w:t>
+            </w:r>
+          </w:p>
+        </w:tc>
+        <w:tc>
+          <w:tcPr>
+            <w:tcW w:type="dxa" w:w="2880"/>
+          </w:tcPr>
+          <w:p>
+            <w:r>
+              <w:t>Web y API en Azure (http://4.206.201.129) con PostgreSQL.</w:t>
+            </w:r>
+          </w:p>
+        </w:tc>
+      </w:tr>
+      <w:tr>
+        <w:tc>
+          <w:tcPr>
+            <w:tcW w:type="dxa" w:w="2880"/>
+          </w:tcPr>
+          <w:p>
+            <w:r>
+              <w:t>Plataforma móvil consumiendo la API</w:t>
+            </w:r>
+          </w:p>
+        </w:tc>
+        <w:tc>
+          <w:tcPr>
+            <w:tcW w:type="dxa" w:w="2880"/>
+          </w:tcPr>
+          <w:p>
+            <w:r>
+              <w:t>Cumple</w:t>
+            </w:r>
+          </w:p>
+        </w:tc>
+        <w:tc>
+          <w:tcPr>
+            <w:tcW w:type="dxa" w:w="2880"/>
+          </w:tcPr>
+          <w:p>
+            <w:r>
+              <w:t>APK compilado con la URL de la API de Azure (no probado en un dispositivo físico).</w:t>
+            </w:r>
+          </w:p>
+        </w:tc>
+      </w:tr>
+      <w:tr>
+        <w:tc>
+          <w:tcPr>
+            <w:tcW w:type="dxa" w:w="2880"/>
+          </w:tcPr>
+          <w:p>
+            <w:r>
+              <w:t>Análisis exploratorio con dashboard</w:t>
+            </w:r>
+          </w:p>
+        </w:tc>
+        <w:tc>
+          <w:tcPr>
+            <w:tcW w:type="dxa" w:w="2880"/>
+          </w:tcPr>
+          <w:p>
+            <w:r>
+              <w:t>Cumple</w:t>
+            </w:r>
+          </w:p>
+        </w:tc>
+        <w:tc>
+          <w:tcPr>
+            <w:tcW w:type="dxa" w:w="2880"/>
+          </w:tcPr>
+          <w:p>
+            <w:r>
+              <w:t>Dashboard administrativo y analytics/eda_tutoudec.py con informe y gráficas.</w:t>
+            </w:r>
+          </w:p>
+        </w:tc>
+      </w:tr>
+      <w:tr>
+        <w:tc>
+          <w:tcPr>
+            <w:tcW w:type="dxa" w:w="2880"/>
+          </w:tcPr>
+          <w:p>
+            <w:r>
+              <w:t>Desplegado en Azure o similar</w:t>
+            </w:r>
+          </w:p>
+        </w:tc>
+        <w:tc>
+          <w:tcPr>
+            <w:tcW w:type="dxa" w:w="2880"/>
+          </w:tcPr>
+          <w:p>
+            <w:r>
+              <w:t>Cumple</w:t>
+            </w:r>
+          </w:p>
+        </w:tc>
+        <w:tc>
+          <w:tcPr>
+            <w:tcW w:type="dxa" w:w="2880"/>
+          </w:tcPr>
+          <w:p>
+            <w:r>
+              <w:t>VM Linux en Azure con nginx, gunicorn y PostgreSQL.</w:t>
+            </w:r>
+          </w:p>
+        </w:tc>
+      </w:tr>
+    </w:tbl>
     <w:sectPr>
       <w:pgSz w:w="12240" w:h="15840"/>
       <w:pgMar w:top="1440" w:right="1800" w:bottom="1440" w:left="1800" w:header="720" w:footer="720" w:gutter="0"/>

</xml_diff>

<commit_message>
APK final con HTTP permitido y recuperar contrasena funcional; Word actualizado
Co-authored-by: Copilot <223556219+Copilot@users.noreply.github.com>
</commit_message>
<xml_diff>
--- a/Documentacion_Tecnica_TutoUdec_Final.docx
+++ b/Documentacion_Tecnica_TutoUdec_Final.docx
@@ -1230,7 +1230,23 @@
         <w:pStyle w:val="ListBullet"/>
       </w:pPr>
       <w:r>
-        <w:t>La app permite tráfico HTTP (usesCleartextTraffic) mientras el servidor no tenga HTTPS.</w:t>
+        <w:t>La app permite tráfico HTTP mediante el plugin expo-build-properties (usesCleartextTraffic). Antes el APK lo bloqueaba y por eso fallaban el registro y el inicio de sesión; verificado en el AndroidManifest del APK.</w:t>
+      </w:r>
+    </w:p>
+    <w:p>
+      <w:pPr>
+        <w:pStyle w:val="ListBullet"/>
+      </w:pPr>
+      <w:r>
+        <w:t>Recuperar contraseña: la pantalla móvil ahora llama a la API (solicitar código y confirmar con nueva contraseña). En Azure no hay SMTP, por lo que se activó PASSWORD_RESET_SHOW_TOKEN=True (solo demostración): la API devuelve el código y la app lo rellena. Para producción configurar EMAIL_HOST_USER y EMAIL_HOST_PASSWORD y desactivar esa variable.</w:t>
+      </w:r>
+    </w:p>
+    <w:p>
+      <w:pPr>
+        <w:pStyle w:val="ListBullet"/>
+      </w:pPr>
+      <w:r>
+        <w:t>Prueba de punta a punta contra Azure: registro (estudiante y tutor), perfil, cambio de contraseña, recuperación, login por usuario y por correo, listados y chatbot: todo OK. 14 pruebas automáticas del backend OK.</w:t>
       </w:r>
     </w:p>
     <w:p>

</xml_diff>

<commit_message>
APK y documentación actualizados (agenda mensual, tutorías, materias)
Co-authored-by: Copilot <223556219+Copilot@users.noreply.github.com>
</commit_message>
<xml_diff>
--- a/Documentacion_Tecnica_TutoUdec_Final.docx
+++ b/Documentacion_Tecnica_TutoUdec_Final.docx
@@ -1254,6 +1254,70 @@
         <w:pStyle w:val="Heading2"/>
       </w:pPr>
       <w:r>
+        <w:t>6.1f Agenda mensual, tutorías y materias en la app</w:t>
+      </w:r>
+    </w:p>
+    <w:p>
+      <w:pPr>
+        <w:pStyle w:val="ListBullet"/>
+      </w:pPr>
+      <w:r>
+        <w:t>Toda la interfaz móvil quedó en español (perfil del tutor, buscador de tutores, inicio del tutor, materias, tutorías).</w:t>
+      </w:r>
+    </w:p>
+    <w:p>
+      <w:pPr>
+        <w:pStyle w:val="ListBullet"/>
+      </w:pPr>
+      <w:r>
+        <w:t>Perfil del tutor: calendario mensual real con navegación por meses. Los días con horarios libres se marcan en verde; al tocar un día se muestran los horarios, y se elige materia, duración (30 a 120 min) y lugar. El botón Agendar registra la tutoría en la API.</w:t>
+      </w:r>
+    </w:p>
+    <w:p>
+      <w:pPr>
+        <w:pStyle w:val="ListBullet"/>
+      </w:pPr>
+      <w:r>
+        <w:t>API: GET /api/tutores/{id}/disponibilidad_mensual/?mes=YYYY-MM&amp;duracion=60 calcula los horarios libres a partir de la disponibilidad semanal del tutor, descartando fechas pasadas y horarios ya reservados.</w:t>
+      </w:r>
+    </w:p>
+    <w:p>
+      <w:pPr>
+        <w:pStyle w:val="ListBullet"/>
+      </w:pPr>
+      <w:r>
+        <w:t>Registro de tutorías validado en el servidor (POST /api/tutorias/): fecha futura, dentro de la disponibilidad del tutor y sin choques con otra tutoría; calcula fecha_fin y tarifa. Las tutorías quedan guardadas en PostgreSQL y aparecen en Mis tutorías.</w:t>
+      </w:r>
+    </w:p>
+    <w:p>
+      <w:pPr>
+        <w:pStyle w:val="ListBullet"/>
+      </w:pPr>
+      <w:r>
+        <w:t>Materias con la misma interfaz que los tutores: descripción, valoración (promedio de sus tutores), número de tutores y tutorías, buscador y pantalla de detalle con los tutores de la materia (tocables hacia su perfil).</w:t>
+      </w:r>
+    </w:p>
+    <w:p>
+      <w:pPr>
+        <w:pStyle w:val="ListBullet"/>
+      </w:pPr>
+      <w:r>
+        <w:t>El detalle del tutor ahora incluye nombre, número de reseñas y últimas reseñas. La paginación acepta ?page_size= (máximo 100).</w:t>
+      </w:r>
+    </w:p>
+    <w:p>
+      <w:pPr>
+        <w:pStyle w:val="ListBullet"/>
+      </w:pPr>
+      <w:r>
+        <w:t>Verificado en Azure de punta a punta: registro, agenda mensual, tutoría creada, rechazo de duplicado y listado en Mis tutorías. 18 pruebas automáticas del backend OK. Nuevo APK compilado con estos cambios.</w:t>
+      </w:r>
+    </w:p>
+    <w:p>
+      <w:pPr>
+        <w:pStyle w:val="Heading2"/>
+      </w:pPr>
+      <w:r>
         <w:t>6.2 Pruebas</w:t>
       </w:r>
     </w:p>

</xml_diff>